<commit_message>
feat: Nang cap toan bo he thong AutoBillApp (VAT 2 chieu, Run-Span Word, toi uu Excel, giao dien van phong, don dep repo)
</commit_message>
<xml_diff>
--- a/templates/HDMB TT100%.docx
+++ b/templates/HDMB TT100%.docx
@@ -313,7 +313,16 @@
       </w:r>
       <w:r>
         <w:rPr>
-          <w:rFonts w:ascii="SimSun" w:hAnsi="SimSun" w:eastAsia="SimSun" w:cs="SimSun"/>
+          <w:rFonts w:hint="default" w:ascii="Times New Roman" w:hAnsi="Times New Roman" w:eastAsia="SimSun" w:cs="Times New Roman"/>
+          <w:sz w:val="26"/>
+          <w:szCs w:val="26"/>
+          <w:lang w:val="en-US"/>
+        </w:rPr>
+        <w:t xml:space="preserve"> </w:t>
+      </w:r>
+      <w:r>
+        <w:rPr>
+          <w:rFonts w:hint="default" w:ascii="Times New Roman" w:hAnsi="Times New Roman" w:eastAsia="SimSun" w:cs="Times New Roman"/>
           <w:sz w:val="26"/>
           <w:szCs w:val="26"/>
         </w:rPr>
@@ -321,7 +330,7 @@
       </w:r>
       <w:r>
         <w:rPr>
-          <w:rFonts w:hint="default" w:ascii="SimSun" w:hAnsi="SimSun" w:eastAsia="SimSun" w:cs="SimSun"/>
+          <w:rFonts w:hint="default" w:eastAsia="SimSun" w:cs="Times New Roman"/>
           <w:sz w:val="26"/>
           <w:szCs w:val="26"/>
           <w:lang w:val="en-US"/>
@@ -338,7 +347,16 @@
       </w:r>
       <w:r>
         <w:rPr>
-          <w:rFonts w:ascii="SimSun" w:hAnsi="SimSun" w:eastAsia="SimSun" w:cs="SimSun"/>
+          <w:rFonts w:hint="default" w:ascii="Times New Roman" w:hAnsi="Times New Roman" w:eastAsia="SimSun" w:cs="Times New Roman"/>
+          <w:sz w:val="26"/>
+          <w:szCs w:val="26"/>
+          <w:lang w:val="en-US"/>
+        </w:rPr>
+        <w:t xml:space="preserve"> </w:t>
+      </w:r>
+      <w:r>
+        <w:rPr>
+          <w:rFonts w:hint="default" w:ascii="Times New Roman" w:hAnsi="Times New Roman" w:eastAsia="SimSun" w:cs="Times New Roman"/>
           <w:sz w:val="26"/>
           <w:szCs w:val="26"/>
         </w:rPr>
@@ -346,31 +364,40 @@
       </w:r>
       <w:r>
         <w:rPr>
-          <w:rFonts w:hint="default" w:ascii="SimSun" w:hAnsi="SimSun" w:eastAsia="SimSun" w:cs="SimSun"/>
+          <w:rFonts w:hint="default" w:eastAsia="SimSun" w:cs="Times New Roman"/>
           <w:sz w:val="26"/>
           <w:szCs w:val="26"/>
           <w:lang w:val="en-US"/>
         </w:rPr>
         <w:t xml:space="preserve"> </w:t>
-      </w:r>
-      <w:r>
-        <w:rPr>
-          <w:rFonts w:hint="default" w:ascii="Times New Roman" w:hAnsi="Times New Roman" w:eastAsia="SimSun" w:cs="Times New Roman"/>
-          <w:sz w:val="26"/>
-          <w:szCs w:val="26"/>
-        </w:rPr>
-        <w:t>năm</w:t>
-      </w:r>
-      <w:r>
-        <w:rPr>
-          <w:rFonts w:ascii="SimSun" w:hAnsi="SimSun" w:eastAsia="SimSun" w:cs="SimSun"/>
-          <w:sz w:val="26"/>
-          <w:szCs w:val="26"/>
-        </w:rPr>
-        <w:t>{nam_ky}</w:t>
       </w:r>
       <w:bookmarkStart w:id="1" w:name="_GoBack"/>
       <w:bookmarkEnd w:id="1"/>
+      <w:r>
+        <w:rPr>
+          <w:rFonts w:hint="default" w:ascii="Times New Roman" w:hAnsi="Times New Roman" w:eastAsia="SimSun" w:cs="Times New Roman"/>
+          <w:sz w:val="26"/>
+          <w:szCs w:val="26"/>
+        </w:rPr>
+        <w:t>năm</w:t>
+      </w:r>
+      <w:r>
+        <w:rPr>
+          <w:rFonts w:hint="default" w:ascii="Times New Roman" w:hAnsi="Times New Roman" w:eastAsia="SimSun" w:cs="Times New Roman"/>
+          <w:sz w:val="26"/>
+          <w:szCs w:val="26"/>
+          <w:lang w:val="en-US"/>
+        </w:rPr>
+        <w:t xml:space="preserve"> </w:t>
+      </w:r>
+      <w:r>
+        <w:rPr>
+          <w:rFonts w:hint="default" w:ascii="Times New Roman" w:hAnsi="Times New Roman" w:eastAsia="SimSun" w:cs="Times New Roman"/>
+          <w:sz w:val="26"/>
+          <w:szCs w:val="26"/>
+        </w:rPr>
+        <w:t>{nam_ky}</w:t>
+      </w:r>
       <w:r>
         <w:rPr>
           <w:sz w:val="26"/>
@@ -7267,6 +7294,13 @@
         <w:ind w:left="709" w:hanging="709"/>
         <w:jc w:val="both"/>
         <w:rPr>
+          <w:rFonts w:ascii="Times New Roman" w:hAnsi="Times New Roman" w:cs="Times New Roman"/>
+          <w:b w:val="0"/>
+          <w:lang w:val="vi-VN"/>
+        </w:rPr>
+      </w:pPr>
+      <w:r>
+        <w:rPr>
           <w:rFonts w:cs="Times New Roman"/>
           <w:color w:val="000000" w:themeColor="text1"/>
           <w:szCs w:val="26"/>
@@ -7277,35 +7311,8 @@
             </w14:solidFill>
           </w14:textFill>
         </w:rPr>
-      </w:pPr>
-      <w:r>
-        <w:rPr>
-          <w:rFonts w:cs="Times New Roman"/>
-          <w:color w:val="000000" w:themeColor="text1"/>
-          <w:szCs w:val="26"/>
-          <w:lang w:val="vi-VN"/>
-          <w14:textFill>
-            <w14:solidFill>
-              <w14:schemeClr w14:val="tx1"/>
-            </w14:solidFill>
-          </w14:textFill>
-        </w:rPr>
         <w:t>Nghĩa vụ được quy định tại Điều 11.1 của Hợp Đồng này được tuân thủ bởi Các Bên trong suốt thời gian Hợp Đồng có hiệu lực, sau khi Hợp Đồng đã hoàn thành và cả khi Hợp Đồng này bị chấm dứt hoặc hủy bỏ.</w:t>
       </w:r>
-    </w:p>
-    <w:p>
-      <w:pPr>
-        <w:pStyle w:val="167"/>
-        <w:widowControl w:val="0"/>
-        <w:spacing w:line="276" w:lineRule="auto"/>
-        <w:ind w:left="567"/>
-        <w:jc w:val="both"/>
-        <w:rPr>
-          <w:rFonts w:ascii="Times New Roman" w:hAnsi="Times New Roman" w:cs="Times New Roman"/>
-          <w:b w:val="0"/>
-          <w:lang w:val="vi-VN"/>
-        </w:rPr>
-      </w:pPr>
     </w:p>
     <w:p>
       <w:pPr>
@@ -7963,7 +7970,7 @@
                 <w:szCs w:val="26"/>
                 <w:lang w:val="vi-VN"/>
               </w:rPr>
-              <w:t xml:space="preserve">           ĐẠI DIỆN BÊN B (BÊN BÁN)</w:t>
+              <w:t>ĐẠI DIỆN BÊN B (BÊN BÁN)</w:t>
             </w:r>
             <w:r>
               <w:rPr>
@@ -7981,7 +7988,7 @@
                 <w:szCs w:val="26"/>
                 <w:lang w:val="vi-VN"/>
               </w:rPr>
-              <w:t xml:space="preserve">           (Ký, ghi rõ họ tên và đóng dấu)</w:t>
+              <w:t xml:space="preserve">  (Ký, ghi rõ họ tên và đóng dấu)</w:t>
             </w:r>
           </w:p>
           <w:p>

</xml_diff>

<commit_message>
fix & perf: toi uu hieu nang form chong mo man hinh, tang toc xuat zip 8x, giu nguyen gia bao gia va bo sung form nhap chung tu
</commit_message>
<xml_diff>
--- a/templates/HDMB TT100%.docx
+++ b/templates/HDMB TT100%.docx
@@ -49,9 +49,10 @@
         <w:spacing w:after="0"/>
         <w:jc w:val="center"/>
         <w:rPr>
-          <w:i/>
-          <w:sz w:val="26"/>
-          <w:szCs w:val="26"/>
+          <w:rFonts w:hint="default" w:ascii="Times New Roman" w:hAnsi="Times New Roman" w:cs="Times New Roman"/>
+          <w:sz w:val="26"/>
+          <w:szCs w:val="26"/>
+          <w:highlight w:val="none"/>
         </w:rPr>
       </w:pPr>
       <w:r>
@@ -162,7 +163,7 @@
       </w:r>
       <w:r>
         <w:rPr>
-          <w:rFonts w:ascii="SimSun" w:hAnsi="SimSun" w:eastAsia="SimSun" w:cs="SimSun"/>
+          <w:rFonts w:hint="default" w:ascii="Times New Roman" w:hAnsi="Times New Roman" w:eastAsia="SimSun" w:cs="Times New Roman"/>
           <w:sz w:val="26"/>
           <w:szCs w:val="26"/>
         </w:rPr>
@@ -170,19 +171,27 @@
       </w:r>
       <w:r>
         <w:rPr>
+          <w:rFonts w:hint="default" w:ascii="Times New Roman" w:hAnsi="Times New Roman" w:cs="Times New Roman"/>
           <w:sz w:val="26"/>
           <w:szCs w:val="26"/>
           <w:highlight w:val="none"/>
         </w:rPr>
-        <w:t xml:space="preserve">/HĐMB/VGG- </w:t>
-      </w:r>
-      <w:r>
-        <w:rPr>
-          <w:sz w:val="26"/>
-          <w:szCs w:val="26"/>
-        </w:rPr>
-        <w:br w:type="textWrapping"/>
-      </w:r>
+        <w:t xml:space="preserve"> </w:t>
+      </w:r>
+    </w:p>
+    <w:p>
+      <w:pPr>
+        <w:spacing w:after="0"/>
+        <w:jc w:val="center"/>
+        <w:rPr>
+          <w:rFonts w:hint="default" w:ascii="Times New Roman" w:hAnsi="Times New Roman" w:cs="Times New Roman"/>
+          <w:sz w:val="26"/>
+          <w:szCs w:val="26"/>
+          <w:highlight w:val="none"/>
+        </w:rPr>
+      </w:pPr>
+      <w:bookmarkStart w:id="1" w:name="_GoBack"/>
+      <w:bookmarkEnd w:id="1"/>
     </w:p>
     <w:p>
       <w:pPr>
@@ -371,8 +380,6 @@
         </w:rPr>
         <w:t xml:space="preserve"> </w:t>
       </w:r>
-      <w:bookmarkStart w:id="1" w:name="_GoBack"/>
-      <w:bookmarkEnd w:id="1"/>
       <w:r>
         <w:rPr>
           <w:rFonts w:hint="default" w:ascii="Times New Roman" w:hAnsi="Times New Roman" w:eastAsia="SimSun" w:cs="Times New Roman"/>

</xml_diff>